<commit_message>
Refactor Phase 2 and Phase 3 documentation to enhance clarity on test preparation and execution. - Updated steps to validate test fixtures and added guidance for negative-path tests in Phase 2. - Revised Phase 3 goals to emphasize the importance of completing negative-path tests and preparing for demos. - Improved checkpoint criteria to ensure participants have a solid foundation before moving deeper into testing scenarios. - Enhanced proctoring notes to address common issues and provide clearer guidance for participants.
</commit_message>
<xml_diff>
--- a/docs/phase1-participants.docx
+++ b/docs/phase1-participants.docx
@@ -401,6 +401,94 @@
         <w:pStyle w:val="Heading2"/>
       </w:pPr>
       <w:r>
+        <w:t>Step 7: Create Mock Data for Testing (10 min)</w:t>
+      </w:r>
+    </w:p>
+    <w:p>
+      <w:r>
+        <w:t>Prepare a small fixture set now so Playwright work in Phase 2 starts faster.</w:t>
+      </w:r>
+    </w:p>
+    <w:p>
+      <w:r>
+        <w:t>**Create a test data folder:**</w:t>
+      </w:r>
+    </w:p>
+    <w:p>
+      <w:pPr>
+        <w:pStyle w:val="ListBullet"/>
+      </w:pPr>
+      <w:r>
+        <w:t>`test-data/valid/` with at least one valid input example</w:t>
+      </w:r>
+    </w:p>
+    <w:p>
+      <w:pPr>
+        <w:pStyle w:val="ListBullet"/>
+      </w:pPr>
+      <w:r>
+        <w:t>`test-data/invalid/` with at least two invalid examples</w:t>
+      </w:r>
+    </w:p>
+    <w:p>
+      <w:r>
+        <w:t>**Minimum fixture set:**</w:t>
+      </w:r>
+    </w:p>
+    <w:p>
+      <w:pPr>
+        <w:pStyle w:val="ListBullet"/>
+      </w:pPr>
+      <w:r>
+        <w:t>One valid JSON payload (or form field set)</w:t>
+      </w:r>
+    </w:p>
+    <w:p>
+      <w:pPr>
+        <w:pStyle w:val="ListBullet"/>
+      </w:pPr>
+      <w:r>
+        <w:t>One invalid case with a missing required field</w:t>
+      </w:r>
+    </w:p>
+    <w:p>
+      <w:pPr>
+        <w:pStyle w:val="ListBullet"/>
+      </w:pPr>
+      <w:r>
+        <w:t>One invalid case with a bad value (negative amount, invalid date, etc.)</w:t>
+      </w:r>
+    </w:p>
+    <w:p>
+      <w:r>
+        <w:t>**Optional (if you plan file-upload scenarios):**</w:t>
+      </w:r>
+    </w:p>
+    <w:p>
+      <w:pPr>
+        <w:pStyle w:val="ListBullet"/>
+      </w:pPr>
+      <w:r>
+        <w:t>Add one sample PDF in `test-data/files/`</w:t>
+      </w:r>
+    </w:p>
+    <w:p>
+      <w:pPr>
+        <w:ind w:left="720"/>
+      </w:pPr>
+      <w:r>
+        <w:rPr>
+          <w:i/>
+        </w:rPr>
+        <w:t>**Copilot tip:** *"Generate three test fixtures for this schema: one valid, one missing required field, and one invalid value case. Save them in a test-data folder."*</w:t>
+      </w:r>
+    </w:p>
+    <w:p/>
+    <w:p>
+      <w:pPr>
+        <w:pStyle w:val="Heading2"/>
+      </w:pPr>
+      <w:r>
         <w:t>Checkpoint</w:t>
       </w:r>
     </w:p>
@@ -439,6 +527,14 @@
       </w:pPr>
       <w:r>
         <w:t>[ ] At least 2-3 validation rules working</w:t>
+      </w:r>
+    </w:p>
+    <w:p>
+      <w:pPr>
+        <w:pStyle w:val="ListBullet"/>
+      </w:pPr>
+      <w:r>
+        <w:t>[ ] A small fixture set ready for Phase 2 Playwright tests</w:t>
       </w:r>
     </w:p>
     <w:p>

</xml_diff>